<commit_message>
Fill startup passport items 25-27
Co-Authored-By: Claude Sonnet 5.5 <noreply@anthropic.com>
Claude-Session: https://claude.ai/code/session_01ADSquzsspwAL5eKo1c74of
</commit_message>
<xml_diff>
--- a/Паспорт_стартап-проекта_LawTracker.docx
+++ b/Паспорт_стартап-проекта_LawTracker.docx
@@ -6107,8 +6107,242 @@
             </w:pPr>
             <w:r>
               <w:rPr>
-                <w:rtl w:val="0"/>
-              </w:rPr>
+                <w:rFonts w:ascii="Times New Roman" w:cs="Times New Roman" w:eastAsia="Times New Roman" w:hAnsi="Times New Roman"/>
+                <w:sz w:val="20"/>
+                <w:szCs w:val="20"/>
+                <w:rtl w:val="0"/>
+              </w:rPr>
+              <w:t xml:space="preserve">Проблема, описанная в пункте 10, раскрывается по четырём составляющим; платформа закрывает их в разной степени.</w:t>
+            </w:r>
+          </w:p>
+          <w:p>
+            <w:pPr>
+              <w:widowControl w:val="0"/>
+              <w:spacing w:line="240" w:lineRule="auto"/>
+              <w:ind w:firstLine="360"/>
+              <w:jc w:val="both"/>
+              <w:rPr>
+                <w:rFonts w:ascii="Times New Roman" w:cs="Times New Roman" w:eastAsia="Times New Roman" w:hAnsi="Times New Roman"/>
+                <w:sz w:val="20"/>
+                <w:szCs w:val="20"/>
+                <w:highlight w:val="red"/>
+              </w:rPr>
+            </w:pPr>
+            <w:r>
+              <w:rPr>
+                <w:rFonts w:ascii="Times New Roman" w:cs="Times New Roman" w:eastAsia="Times New Roman" w:hAnsi="Times New Roman"/>
+                <w:sz w:val="20"/>
+                <w:szCs w:val="20"/>
+                <w:rtl w:val="0"/>
+              </w:rPr>
+              <w:t xml:space="preserve">Решается полностью или в значительной части:</w:t>
+            </w:r>
+          </w:p>
+          <w:p>
+            <w:pPr>
+              <w:widowControl w:val="0"/>
+              <w:spacing w:line="240" w:lineRule="auto"/>
+              <w:ind w:firstLine="360"/>
+              <w:jc w:val="both"/>
+              <w:rPr>
+                <w:rFonts w:ascii="Times New Roman" w:cs="Times New Roman" w:eastAsia="Times New Roman" w:hAnsi="Times New Roman"/>
+                <w:sz w:val="20"/>
+                <w:szCs w:val="20"/>
+                <w:highlight w:val="red"/>
+              </w:rPr>
+            </w:pPr>
+            <w:r>
+              <w:rPr>
+                <w:rFonts w:ascii="Times New Roman" w:cs="Times New Roman" w:eastAsia="Times New Roman" w:hAnsi="Times New Roman"/>
+                <w:sz w:val="20"/>
+                <w:szCs w:val="20"/>
+                <w:rtl w:val="0"/>
+              </w:rPr>
+              <w:t xml:space="preserve">1) поиск и отбор — вместо ручного отслеживания потока актов компания получает только изменения, отобранные под её профиль;</w:t>
+            </w:r>
+          </w:p>
+          <w:p>
+            <w:pPr>
+              <w:widowControl w:val="0"/>
+              <w:spacing w:line="240" w:lineRule="auto"/>
+              <w:ind w:firstLine="360"/>
+              <w:jc w:val="both"/>
+              <w:rPr>
+                <w:rFonts w:ascii="Times New Roman" w:cs="Times New Roman" w:eastAsia="Times New Roman" w:hAnsi="Times New Roman"/>
+                <w:sz w:val="20"/>
+                <w:szCs w:val="20"/>
+                <w:highlight w:val="red"/>
+              </w:rPr>
+            </w:pPr>
+            <w:r>
+              <w:rPr>
+                <w:rFonts w:ascii="Times New Roman" w:cs="Times New Roman" w:eastAsia="Times New Roman" w:hAnsi="Times New Roman"/>
+                <w:sz w:val="20"/>
+                <w:szCs w:val="20"/>
+                <w:rtl w:val="0"/>
+              </w:rPr>
+              <w:t xml:space="preserve">2) понимание — юридический текст переводится в краткий вывод и объяснение простым языком с разделением на изложение, аналитику платформы и первоисточник;</w:t>
+            </w:r>
+          </w:p>
+          <w:p>
+            <w:pPr>
+              <w:widowControl w:val="0"/>
+              <w:spacing w:line="240" w:lineRule="auto"/>
+              <w:ind w:firstLine="360"/>
+              <w:jc w:val="both"/>
+              <w:rPr>
+                <w:rFonts w:ascii="Times New Roman" w:cs="Times New Roman" w:eastAsia="Times New Roman" w:hAnsi="Times New Roman"/>
+                <w:sz w:val="20"/>
+                <w:szCs w:val="20"/>
+                <w:highlight w:val="red"/>
+              </w:rPr>
+            </w:pPr>
+            <w:r>
+              <w:rPr>
+                <w:rFonts w:ascii="Times New Roman" w:cs="Times New Roman" w:eastAsia="Times New Roman" w:hAnsi="Times New Roman"/>
+                <w:sz w:val="20"/>
+                <w:szCs w:val="20"/>
+                <w:rtl w:val="0"/>
+              </w:rPr>
+              <w:t xml:space="preserve">3) определение применимости — клиент видит, относится ли изменение к его компании и какие параметры профиля к этому привели;</w:t>
+            </w:r>
+          </w:p>
+          <w:p>
+            <w:pPr>
+              <w:widowControl w:val="0"/>
+              <w:spacing w:line="240" w:lineRule="auto"/>
+              <w:ind w:firstLine="360"/>
+              <w:jc w:val="both"/>
+              <w:rPr>
+                <w:rFonts w:ascii="Times New Roman" w:cs="Times New Roman" w:eastAsia="Times New Roman" w:hAnsi="Times New Roman"/>
+                <w:sz w:val="20"/>
+                <w:szCs w:val="20"/>
+                <w:highlight w:val="red"/>
+              </w:rPr>
+            </w:pPr>
+            <w:r>
+              <w:rPr>
+                <w:rFonts w:ascii="Times New Roman" w:cs="Times New Roman" w:eastAsia="Times New Roman" w:hAnsi="Times New Roman"/>
+                <w:sz w:val="20"/>
+                <w:szCs w:val="20"/>
+                <w:rtl w:val="0"/>
+              </w:rPr>
+              <w:t xml:space="preserve">4) контроль сроков — даты вступления в силу, напоминания и первичный перечень действий с ответственными и сроками.</w:t>
+            </w:r>
+          </w:p>
+          <w:p>
+            <w:pPr>
+              <w:widowControl w:val="0"/>
+              <w:spacing w:line="240" w:lineRule="auto"/>
+              <w:ind w:firstLine="360"/>
+              <w:jc w:val="both"/>
+              <w:rPr>
+                <w:rFonts w:ascii="Times New Roman" w:cs="Times New Roman" w:eastAsia="Times New Roman" w:hAnsi="Times New Roman"/>
+                <w:sz w:val="20"/>
+                <w:szCs w:val="20"/>
+                <w:highlight w:val="red"/>
+              </w:rPr>
+            </w:pPr>
+            <w:r>
+              <w:rPr>
+                <w:rFonts w:ascii="Times New Roman" w:cs="Times New Roman" w:eastAsia="Times New Roman" w:hAnsi="Times New Roman"/>
+                <w:sz w:val="20"/>
+                <w:szCs w:val="20"/>
+                <w:rtl w:val="0"/>
+              </w:rPr>
+              <w:t xml:space="preserve">Решается частично:</w:t>
+            </w:r>
+          </w:p>
+          <w:p>
+            <w:pPr>
+              <w:widowControl w:val="0"/>
+              <w:spacing w:line="240" w:lineRule="auto"/>
+              <w:ind w:firstLine="360"/>
+              <w:jc w:val="both"/>
+              <w:rPr>
+                <w:rFonts w:ascii="Times New Roman" w:cs="Times New Roman" w:eastAsia="Times New Roman" w:hAnsi="Times New Roman"/>
+                <w:sz w:val="20"/>
+                <w:szCs w:val="20"/>
+                <w:highlight w:val="red"/>
+              </w:rPr>
+            </w:pPr>
+            <w:r>
+              <w:rPr>
+                <w:rFonts w:ascii="Times New Roman" w:cs="Times New Roman" w:eastAsia="Times New Roman" w:hAnsi="Times New Roman"/>
+                <w:sz w:val="20"/>
+                <w:szCs w:val="20"/>
+                <w:rtl w:val="0"/>
+              </w:rPr>
+              <w:t xml:space="preserve">— оценка юридических последствий и итоговое решение остаются за человеком (руководителем, юристом): платформа даёт предварительный анализ с указанием уровня уверенности и не является юридическим заключением;</w:t>
+            </w:r>
+          </w:p>
+          <w:p>
+            <w:pPr>
+              <w:widowControl w:val="0"/>
+              <w:spacing w:line="240" w:lineRule="auto"/>
+              <w:ind w:firstLine="360"/>
+              <w:jc w:val="both"/>
+              <w:rPr>
+                <w:rFonts w:ascii="Times New Roman" w:cs="Times New Roman" w:eastAsia="Times New Roman" w:hAnsi="Times New Roman"/>
+                <w:sz w:val="20"/>
+                <w:szCs w:val="20"/>
+                <w:highlight w:val="red"/>
+              </w:rPr>
+            </w:pPr>
+            <w:r>
+              <w:rPr>
+                <w:rFonts w:ascii="Times New Roman" w:cs="Times New Roman" w:eastAsia="Times New Roman" w:hAnsi="Times New Roman"/>
+                <w:sz w:val="20"/>
+                <w:szCs w:val="20"/>
+                <w:rtl w:val="0"/>
+              </w:rPr>
+              <w:t xml:space="preserve">— точность подбора зависит от полноты профиля компании и качества проверки материалов юристом;</w:t>
+            </w:r>
+          </w:p>
+          <w:p>
+            <w:pPr>
+              <w:widowControl w:val="0"/>
+              <w:spacing w:line="240" w:lineRule="auto"/>
+              <w:ind w:firstLine="360"/>
+              <w:jc w:val="both"/>
+              <w:rPr>
+                <w:rFonts w:ascii="Times New Roman" w:cs="Times New Roman" w:eastAsia="Times New Roman" w:hAnsi="Times New Roman"/>
+                <w:sz w:val="20"/>
+                <w:szCs w:val="20"/>
+                <w:highlight w:val="red"/>
+              </w:rPr>
+            </w:pPr>
+            <w:r>
+              <w:rPr>
+                <w:rFonts w:ascii="Times New Roman" w:cs="Times New Roman" w:eastAsia="Times New Roman" w:hAnsi="Times New Roman"/>
+                <w:sz w:val="20"/>
+                <w:szCs w:val="20"/>
+                <w:rtl w:val="0"/>
+              </w:rPr>
+              <w:t xml:space="preserve">— на первом этапе охватываются федеральные акты и приоритетные отрасли (интернет-торговля, IT, персональные данные, трудовое право и др.); региональные акты, разъяснения и правила торговых площадок планируется добавлять на следующих этапах.</w:t>
+            </w:r>
+          </w:p>
+          <w:p>
+            <w:pPr>
+              <w:widowControl w:val="0"/>
+              <w:spacing w:line="240" w:lineRule="auto"/>
+              <w:ind w:firstLine="360"/>
+              <w:jc w:val="both"/>
+              <w:rPr>
+                <w:rFonts w:ascii="Times New Roman" w:cs="Times New Roman" w:eastAsia="Times New Roman" w:hAnsi="Times New Roman"/>
+                <w:sz w:val="20"/>
+                <w:szCs w:val="20"/>
+                <w:highlight w:val="red"/>
+              </w:rPr>
+            </w:pPr>
+            <w:r>
+              <w:rPr>
+                <w:rFonts w:ascii="Times New Roman" w:cs="Times New Roman" w:eastAsia="Times New Roman" w:hAnsi="Times New Roman"/>
+                <w:sz w:val="20"/>
+                <w:szCs w:val="20"/>
+                <w:rtl w:val="0"/>
+              </w:rPr>
+              <w:t xml:space="preserve">Не решается: непосредственное исполнение требований (изменение документов, договоров и процессов) остаётся на стороне компании; платформа не оказывает юридических услуг и не представляет интересы клиента.</w:t>
             </w:r>
           </w:p>
         </w:tc>
@@ -6208,8 +6442,100 @@
             </w:pPr>
             <w:r>
               <w:rPr>
-                <w:rtl w:val="0"/>
-              </w:rPr>
+                <w:rFonts w:ascii="Times New Roman" w:cs="Times New Roman" w:eastAsia="Times New Roman" w:hAnsi="Times New Roman"/>
+                <w:sz w:val="20"/>
+                <w:szCs w:val="20"/>
+                <w:rtl w:val="0"/>
+              </w:rPr>
+              <w:t xml:space="preserve">«Держатель» проблемы — тот, кто отвечает за соблюдение требований и несёт риск при их нарушении, и тот, на кого ложится мониторинг.</w:t>
+            </w:r>
+          </w:p>
+          <w:p>
+            <w:pPr>
+              <w:widowControl w:val="0"/>
+              <w:spacing w:line="240" w:lineRule="auto"/>
+              <w:ind w:firstLine="360"/>
+              <w:jc w:val="both"/>
+              <w:rPr>
+                <w:rFonts w:ascii="Times New Roman" w:cs="Times New Roman" w:eastAsia="Times New Roman" w:hAnsi="Times New Roman"/>
+                <w:sz w:val="20"/>
+                <w:szCs w:val="20"/>
+              </w:rPr>
+            </w:pPr>
+            <w:r>
+              <w:rPr>
+                <w:rFonts w:ascii="Times New Roman" w:cs="Times New Roman" w:eastAsia="Times New Roman" w:hAnsi="Times New Roman"/>
+                <w:sz w:val="20"/>
+                <w:szCs w:val="20"/>
+                <w:rtl w:val="0"/>
+              </w:rPr>
+              <w:t xml:space="preserve">Кто это (связь с пунктами 9–11): собственники и руководители малого и среднего бизнеса и ИП (принимают решения и отвечают за последствия); бухгалтеры, юристы, HR-специалисты, специалисты по комплаенсу и руководители направлений (выполняют мониторинг и адаптацию); бухгалтерские и юридические фирмы, которые ведут десятки компаний-клиентов.</w:t>
+            </w:r>
+          </w:p>
+          <w:p>
+            <w:pPr>
+              <w:widowControl w:val="0"/>
+              <w:spacing w:line="240" w:lineRule="auto"/>
+              <w:ind w:firstLine="360"/>
+              <w:jc w:val="both"/>
+              <w:rPr>
+                <w:rFonts w:ascii="Times New Roman" w:cs="Times New Roman" w:eastAsia="Times New Roman" w:hAnsi="Times New Roman"/>
+                <w:sz w:val="20"/>
+                <w:szCs w:val="20"/>
+              </w:rPr>
+            </w:pPr>
+            <w:r>
+              <w:rPr>
+                <w:rFonts w:ascii="Times New Roman" w:cs="Times New Roman" w:eastAsia="Times New Roman" w:hAnsi="Times New Roman"/>
+                <w:sz w:val="20"/>
+                <w:szCs w:val="20"/>
+                <w:rtl w:val="0"/>
+              </w:rPr>
+              <w:t xml:space="preserve">Мотивации: избежать штрафов, претензий и срочных переделок; не пропустить сроки вступления норм в силу и подготовиться заранее; сократить время, затрачиваемое на ручной мониторинг; получить уверенность, что значимые изменения учтены; иметь подтверждение того, что компания следит за требованиями.</w:t>
+            </w:r>
+          </w:p>
+          <w:p>
+            <w:pPr>
+              <w:widowControl w:val="0"/>
+              <w:spacing w:line="240" w:lineRule="auto"/>
+              <w:ind w:firstLine="360"/>
+              <w:jc w:val="both"/>
+              <w:rPr>
+                <w:rFonts w:ascii="Times New Roman" w:cs="Times New Roman" w:eastAsia="Times New Roman" w:hAnsi="Times New Roman"/>
+                <w:sz w:val="20"/>
+                <w:szCs w:val="20"/>
+              </w:rPr>
+            </w:pPr>
+            <w:r>
+              <w:rPr>
+                <w:rFonts w:ascii="Times New Roman" w:cs="Times New Roman" w:eastAsia="Times New Roman" w:hAnsi="Times New Roman"/>
+                <w:sz w:val="20"/>
+                <w:szCs w:val="20"/>
+                <w:rtl w:val="0"/>
+              </w:rPr>
+              <w:t xml:space="preserve">Возможности решения без продукта: ручное отслеживание, справочно-правовые системы, новостные каналы и внешние консультанты. У компаний без отдельного юридического подразделения на это обычно не хватает времени, навыков поиска и оценки применимости, а консультанты обычно дороже и не дают постоянного мониторинга.</w:t>
+            </w:r>
+          </w:p>
+          <w:p>
+            <w:pPr>
+              <w:widowControl w:val="0"/>
+              <w:spacing w:line="240" w:lineRule="auto"/>
+              <w:ind w:firstLine="360"/>
+              <w:jc w:val="both"/>
+              <w:rPr>
+                <w:rFonts w:ascii="Times New Roman" w:cs="Times New Roman" w:eastAsia="Times New Roman" w:hAnsi="Times New Roman"/>
+                <w:sz w:val="20"/>
+                <w:szCs w:val="20"/>
+              </w:rPr>
+            </w:pPr>
+            <w:r>
+              <w:rPr>
+                <w:rFonts w:ascii="Times New Roman" w:cs="Times New Roman" w:eastAsia="Times New Roman" w:hAnsi="Times New Roman"/>
+                <w:sz w:val="20"/>
+                <w:szCs w:val="20"/>
+                <w:rtl w:val="0"/>
+              </w:rPr>
+              <w:t xml:space="preserve">Возможности с продуктом: держатель проблемы получает отобранные изменения в понятной форме с планом и сроками за подписку (бесплатный старт, платные тарифы от 690 ₽ в месяц), может поручить действия ответственным сотрудникам и получать напоминания в кабинете и Telegram. Решение по каждому изменению он принимает сам, опираясь на ссылку на первоисточник и, при необходимости, консультацию юриста.</w:t>
             </w:r>
           </w:p>
         </w:tc>
@@ -6309,8 +6635,210 @@
             </w:pPr>
             <w:r>
               <w:rPr>
-                <w:rtl w:val="0"/>
-              </w:rPr>
+                <w:rFonts w:ascii="Times New Roman" w:cs="Times New Roman" w:eastAsia="Times New Roman" w:hAnsi="Times New Roman"/>
+                <w:sz w:val="20"/>
+                <w:szCs w:val="20"/>
+                <w:rtl w:val="0"/>
+              </w:rPr>
+              <w:t xml:space="preserve">Проблема решается последовательностью шагов внутри платформы:</w:t>
+            </w:r>
+          </w:p>
+          <w:p>
+            <w:pPr>
+              <w:widowControl w:val="0"/>
+              <w:spacing w:line="240" w:lineRule="auto"/>
+              <w:ind w:firstLine="360"/>
+              <w:jc w:val="both"/>
+              <w:rPr>
+                <w:rFonts w:ascii="Times New Roman" w:cs="Times New Roman" w:eastAsia="Times New Roman" w:hAnsi="Times New Roman"/>
+                <w:sz w:val="20"/>
+                <w:szCs w:val="20"/>
+              </w:rPr>
+            </w:pPr>
+            <w:r>
+              <w:rPr>
+                <w:rFonts w:ascii="Times New Roman" w:cs="Times New Roman" w:eastAsia="Times New Roman" w:hAnsi="Times New Roman"/>
+                <w:sz w:val="20"/>
+                <w:szCs w:val="20"/>
+                <w:rtl w:val="0"/>
+              </w:rPr>
+              <w:t xml:space="preserve">1) Профиль компании. Клиент по шагам заполняет профиль (10 разделов: основные сведения, отрасль, регионы, структура, кадры, лицензии, персональные данные, внешнеэкономическая деятельность, цифровые сервисы, контакты); для каждого поля показано, на что оно влияет, необязательные вопросы можно пропустить.</w:t>
+            </w:r>
+          </w:p>
+          <w:p>
+            <w:pPr>
+              <w:widowControl w:val="0"/>
+              <w:spacing w:line="240" w:lineRule="auto"/>
+              <w:ind w:firstLine="360"/>
+              <w:jc w:val="both"/>
+              <w:rPr>
+                <w:rFonts w:ascii="Times New Roman" w:cs="Times New Roman" w:eastAsia="Times New Roman" w:hAnsi="Times New Roman"/>
+                <w:sz w:val="20"/>
+                <w:szCs w:val="20"/>
+              </w:rPr>
+            </w:pPr>
+            <w:r>
+              <w:rPr>
+                <w:rFonts w:ascii="Times New Roman" w:cs="Times New Roman" w:eastAsia="Times New Roman" w:hAnsi="Times New Roman"/>
+                <w:sz w:val="20"/>
+                <w:szCs w:val="20"/>
+                <w:rtl w:val="0"/>
+              </w:rPr>
+              <w:t xml:space="preserve">2) Сбор и разбор актов. Платформа получает новые акты и поправки из официальных источников публикации, нормализует их и с помощью моделей обработки текста выделяет тему, адресатов, сроки, статус и связи с другими актами.</w:t>
+            </w:r>
+          </w:p>
+          <w:p>
+            <w:pPr>
+              <w:widowControl w:val="0"/>
+              <w:spacing w:line="240" w:lineRule="auto"/>
+              <w:ind w:firstLine="360"/>
+              <w:jc w:val="both"/>
+              <w:rPr>
+                <w:rFonts w:ascii="Times New Roman" w:cs="Times New Roman" w:eastAsia="Times New Roman" w:hAnsi="Times New Roman"/>
+                <w:sz w:val="20"/>
+                <w:szCs w:val="20"/>
+              </w:rPr>
+            </w:pPr>
+            <w:r>
+              <w:rPr>
+                <w:rFonts w:ascii="Times New Roman" w:cs="Times New Roman" w:eastAsia="Times New Roman" w:hAnsi="Times New Roman"/>
+                <w:sz w:val="20"/>
+                <w:szCs w:val="20"/>
+                <w:rtl w:val="0"/>
+              </w:rPr>
+              <w:t xml:space="preserve">3) Подбор по применимости. Модель применимости сопоставляет признаки акта с профилем компании, определяет уровень влияния и формирует объяснение «почему это показано вам».</w:t>
+            </w:r>
+          </w:p>
+          <w:p>
+            <w:pPr>
+              <w:widowControl w:val="0"/>
+              <w:spacing w:line="240" w:lineRule="auto"/>
+              <w:ind w:firstLine="360"/>
+              <w:jc w:val="both"/>
+              <w:rPr>
+                <w:rFonts w:ascii="Times New Roman" w:cs="Times New Roman" w:eastAsia="Times New Roman" w:hAnsi="Times New Roman"/>
+                <w:sz w:val="20"/>
+                <w:szCs w:val="20"/>
+              </w:rPr>
+            </w:pPr>
+            <w:r>
+              <w:rPr>
+                <w:rFonts w:ascii="Times New Roman" w:cs="Times New Roman" w:eastAsia="Times New Roman" w:hAnsi="Times New Roman"/>
+                <w:sz w:val="20"/>
+                <w:szCs w:val="20"/>
+                <w:rtl w:val="0"/>
+              </w:rPr>
+              <w:t xml:space="preserve">4) Карточка и дайджест. Клиент получает краткий вывод простым языком, основную информацию (что изменилось, кого касается, когда вступает в силу), аналитический комментарий платформы, ссылку на первоисточник, отметку об уровне уверенности и проверке юристом.</w:t>
+            </w:r>
+          </w:p>
+          <w:p>
+            <w:pPr>
+              <w:widowControl w:val="0"/>
+              <w:spacing w:line="240" w:lineRule="auto"/>
+              <w:ind w:firstLine="360"/>
+              <w:jc w:val="both"/>
+              <w:rPr>
+                <w:rFonts w:ascii="Times New Roman" w:cs="Times New Roman" w:eastAsia="Times New Roman" w:hAnsi="Times New Roman"/>
+                <w:sz w:val="20"/>
+                <w:szCs w:val="20"/>
+              </w:rPr>
+            </w:pPr>
+            <w:r>
+              <w:rPr>
+                <w:rFonts w:ascii="Times New Roman" w:cs="Times New Roman" w:eastAsia="Times New Roman" w:hAnsi="Times New Roman"/>
+                <w:sz w:val="20"/>
+                <w:szCs w:val="20"/>
+                <w:rtl w:val="0"/>
+              </w:rPr>
+              <w:t xml:space="preserve">5) Рекомендации и контроль. К карточке привязываются предполагаемые действия с ответственными и сроками; в кабинете отслеживаются статусы выполнения, приходят напоминания.</w:t>
+            </w:r>
+          </w:p>
+          <w:p>
+            <w:pPr>
+              <w:widowControl w:val="0"/>
+              <w:spacing w:line="240" w:lineRule="auto"/>
+              <w:ind w:firstLine="360"/>
+              <w:jc w:val="both"/>
+              <w:rPr>
+                <w:rFonts w:ascii="Times New Roman" w:cs="Times New Roman" w:eastAsia="Times New Roman" w:hAnsi="Times New Roman"/>
+                <w:sz w:val="20"/>
+                <w:szCs w:val="20"/>
+              </w:rPr>
+            </w:pPr>
+            <w:r>
+              <w:rPr>
+                <w:rFonts w:ascii="Times New Roman" w:cs="Times New Roman" w:eastAsia="Times New Roman" w:hAnsi="Times New Roman"/>
+                <w:sz w:val="20"/>
+                <w:szCs w:val="20"/>
+                <w:rtl w:val="0"/>
+              </w:rPr>
+              <w:t xml:space="preserve">6) Доставка. Дайджесты поступают в личный кабинет, на почту и в Telegram; клиент сам настраивает каналы, частоту, категории, порог значимости, время и паузу.</w:t>
+            </w:r>
+          </w:p>
+          <w:p>
+            <w:pPr>
+              <w:widowControl w:val="0"/>
+              <w:spacing w:line="240" w:lineRule="auto"/>
+              <w:ind w:firstLine="360"/>
+              <w:jc w:val="both"/>
+              <w:rPr>
+                <w:rFonts w:ascii="Times New Roman" w:cs="Times New Roman" w:eastAsia="Times New Roman" w:hAnsi="Times New Roman"/>
+                <w:sz w:val="20"/>
+                <w:szCs w:val="20"/>
+              </w:rPr>
+            </w:pPr>
+            <w:r>
+              <w:rPr>
+                <w:rFonts w:ascii="Times New Roman" w:cs="Times New Roman" w:eastAsia="Times New Roman" w:hAnsi="Times New Roman"/>
+                <w:sz w:val="20"/>
+                <w:szCs w:val="20"/>
+                <w:rtl w:val="0"/>
+              </w:rPr>
+              <w:t xml:space="preserve">7) Качество и доверие. Важные изменения проверяет юрист; пользователи отмечают «полезно / не про нас», и подбор улучшается; в каждом материале есть оговорка о том, что он не заменяет юридическую консультацию.</w:t>
+            </w:r>
+          </w:p>
+          <w:p>
+            <w:pPr>
+              <w:widowControl w:val="0"/>
+              <w:spacing w:line="240" w:lineRule="auto"/>
+              <w:ind w:firstLine="360"/>
+              <w:jc w:val="both"/>
+              <w:rPr>
+                <w:rFonts w:ascii="Times New Roman" w:cs="Times New Roman" w:eastAsia="Times New Roman" w:hAnsi="Times New Roman"/>
+                <w:sz w:val="20"/>
+                <w:szCs w:val="20"/>
+              </w:rPr>
+            </w:pPr>
+            <w:r>
+              <w:rPr>
+                <w:rFonts w:ascii="Times New Roman" w:cs="Times New Roman" w:eastAsia="Times New Roman" w:hAnsi="Times New Roman"/>
+                <w:sz w:val="20"/>
+                <w:szCs w:val="20"/>
+                <w:rtl w:val="0"/>
+              </w:rPr>
+              <w:t xml:space="preserve">Пример (иллюстративный). Появилось требование оформлять согласие на обработку персональных данных отдельным документом. Интернет-магазину, у которого в профиле указан сбор данных клиентов, платформа показывает изменение с объяснением причины показа и сроком, предлагает действия «оформить согласие отдельно от оферты» (юрист) и «обновить формы на сайте» (маркетинг, разработка) и напоминает о дате вступления в силу. Компании без сбора данных этот материал не показывается.</w:t>
+            </w:r>
+          </w:p>
+          <w:p>
+            <w:pPr>
+              <w:widowControl w:val="0"/>
+              <w:spacing w:line="240" w:lineRule="auto"/>
+              <w:ind w:firstLine="360"/>
+              <w:jc w:val="both"/>
+              <w:rPr>
+                <w:rFonts w:ascii="Times New Roman" w:cs="Times New Roman" w:eastAsia="Times New Roman" w:hAnsi="Times New Roman"/>
+                <w:sz w:val="20"/>
+                <w:szCs w:val="20"/>
+              </w:rPr>
+            </w:pPr>
+            <w:r>
+              <w:rPr>
+                <w:rFonts w:ascii="Times New Roman" w:cs="Times New Roman" w:eastAsia="Times New Roman" w:hAnsi="Times New Roman"/>
+                <w:sz w:val="20"/>
+                <w:szCs w:val="20"/>
+                <w:rtl w:val="0"/>
+              </w:rPr>
+              <w:t xml:space="preserve">На следующих этапах планируется формирование персональных планов правовой адаптации, отчётов для руководства и командной работы с задачами.</w:t>
             </w:r>
           </w:p>
         </w:tc>

</xml_diff>